<commit_message>
docs(coach): topologie dashboard central + capture dans le guide Word
</commit_message>
<xml_diff>
--- a/docs/GUIDE-COACH-PWNZZAI.docx
+++ b/docs/GUIDE-COACH-PWNZZAI.docx
@@ -502,6 +502,73 @@
       </w:pPr>
       <w:r>
         <w:t>4. Connexion au dashboard prof (la cohorte)</w:t>
+      </w:r>
+    </w:p>
+    <w:p>
+      <w:r>
+        <w:t>Topologie : un dashboard central, PwnzzAI est un client. Le dashboard prof est une instance unique et partagee, deployee une seule fois cote juicelab. Elle sert a la fois les cohortes JuiceLab (Juice Shop) ET les cohortes PwnzzAI : les deux remontent dans la meme matrice.</w:t>
+      </w:r>
+    </w:p>
+    <w:p>
+      <w:r>
+        <w:t>PwnzzAI ne duplique JAMAIS le code serveur du dashboard. Il s'y branche comme client via la variable JUICELAB_DASHBOARD_URL. Anti-pattern a proscrire : deployer un second dashboard specifique a PwnzzAI.</w:t>
+      </w:r>
+    </w:p>
+    <w:p>
+      <w:r>
+        <w:t>Cas optionnel : si le dashboard central n'existe pas encore et que tu veux le deployer depuis cette machine, le script scripts/deploy-dashboard.sh fait un sparse-checkout pinne du depot juicelab (REF reglee par JUICELAB_DASHBOARD_REF, SHA conseille en prod) et ne tire QUE la partie prof (dashboard/, docker/, scripts/). L'overlay et le Juice Shop eleve ne sont jamais tires. Une fois le dashboard demarre, pointer JUICELAB_DASHBOARD_URL dessus.</w:t>
+      </w:r>
+    </w:p>
+    <w:p>
+      <w:pPr>
+        <w:jc w:val="center"/>
+      </w:pPr>
+      <w:r>
+        <w:drawing>
+          <wp:inline xmlns:a="http://schemas.openxmlformats.org/drawingml/2006/main" xmlns:pic="http://schemas.openxmlformats.org/drawingml/2006/picture">
+            <wp:extent cx="5669280" cy="6232377"/>
+            <wp:docPr id="2" name="Picture 2"/>
+            <wp:cNvGraphicFramePr>
+              <a:graphicFrameLocks noChangeAspect="1"/>
+            </wp:cNvGraphicFramePr>
+            <a:graphic>
+              <a:graphicData uri="http://schemas.openxmlformats.org/drawingml/2006/picture">
+                <pic:pic>
+                  <pic:nvPicPr>
+                    <pic:cNvPr id="0" name="prof-dashboard-light.png"/>
+                    <pic:cNvPicPr/>
+                  </pic:nvPicPr>
+                  <pic:blipFill>
+                    <a:blip r:embed="rId10"/>
+                    <a:stretch>
+                      <a:fillRect/>
+                    </a:stretch>
+                  </pic:blipFill>
+                  <pic:spPr>
+                    <a:xfrm>
+                      <a:off x="0" y="0"/>
+                      <a:ext cx="5669280" cy="6232377"/>
+                    </a:xfrm>
+                    <a:prstGeom prst="rect"/>
+                  </pic:spPr>
+                </pic:pic>
+              </a:graphicData>
+            </a:graphic>
+          </wp:inline>
+        </w:drawing>
+      </w:r>
+    </w:p>
+    <w:p>
+      <w:pPr>
+        <w:jc w:val="center"/>
+      </w:pPr>
+      <w:r>
+        <w:rPr>
+          <w:i/>
+          <w:color w:val="222222"/>
+          <w:sz w:val="18"/>
+        </w:rPr>
+        <w:t>Tableau de bord prof - cohorte PwnzzAI sur l'instance centrale (meme matrice que les cohortes Juice Shop).</w:t>
       </w:r>
     </w:p>
     <w:p>
@@ -1207,7 +1274,7 @@
         <w:drawing>
           <wp:inline xmlns:a="http://schemas.openxmlformats.org/drawingml/2006/main" xmlns:pic="http://schemas.openxmlformats.org/drawingml/2006/picture">
             <wp:extent cx="5669280" cy="2769559"/>
-            <wp:docPr id="2" name="Picture 2"/>
+            <wp:docPr id="3" name="Picture 3"/>
             <wp:cNvGraphicFramePr>
               <a:graphicFrameLocks noChangeAspect="1"/>
             </wp:cNvGraphicFramePr>
@@ -1219,7 +1286,7 @@
                     <pic:cNvPicPr/>
                   </pic:nvPicPr>
                   <pic:blipFill>
-                    <a:blip r:embed="rId10"/>
+                    <a:blip r:embed="rId11"/>
                     <a:stretch>
                       <a:fillRect/>
                     </a:stretch>

</xml_diff>

<commit_message>
docs(eleve): comment ouvrir le panneau coach (bouton JL / #coach) + captures ferme->ouvert
Le panneau est ferme au depart (bouton flottant JL en bas a droite). Encadre
explicite + astuce URL #coach + verif port 8095 + captures coach-closed et
coach-panel, dans GUIDE-FR/EN.md et le docx (build_coach_guide.py regenere).
</commit_message>
<xml_diff>
--- a/docs/GUIDE-COACH-PWNZZAI.docx
+++ b/docs/GUIDE-COACH-PWNZZAI.docx
@@ -864,6 +864,121 @@
     </w:p>
     <w:p>
       <w:pPr>
+        <w:shd w:val="clear" w:fill="FFF4D6"/>
+      </w:pPr>
+      <w:r>
+        <w:rPr>
+          <w:sz w:val="21"/>
+        </w:rPr>
+        <w:t>Le panneau coach est FERME au depart, il n'apparait pas tout seul. Pour l'ouvrir : cliquer le bouton rond violet JL en bas a droite, OU ajouter #coach a la fin de l'URL d'un lab (ex. http://localhost:8095/direct-prompt-injection#coach), le panneau s'ouvre alors automatiquement. Verifier d'etre sur le port 8095 (le coach), pas l'app brute. Si rien n'apparait : Ctrl+Shift+R.</w:t>
+      </w:r>
+    </w:p>
+    <w:p>
+      <w:pPr>
+        <w:jc w:val="center"/>
+      </w:pPr>
+      <w:r>
+        <w:drawing>
+          <wp:inline xmlns:a="http://schemas.openxmlformats.org/drawingml/2006/main" xmlns:pic="http://schemas.openxmlformats.org/drawingml/2006/picture">
+            <wp:extent cx="5669280" cy="3639065"/>
+            <wp:docPr id="3" name="Picture 3"/>
+            <wp:cNvGraphicFramePr>
+              <a:graphicFrameLocks noChangeAspect="1"/>
+            </wp:cNvGraphicFramePr>
+            <a:graphic>
+              <a:graphicData uri="http://schemas.openxmlformats.org/drawingml/2006/picture">
+                <pic:pic>
+                  <pic:nvPicPr>
+                    <pic:cNvPr id="0" name="coach-closed.png"/>
+                    <pic:cNvPicPr/>
+                  </pic:nvPicPr>
+                  <pic:blipFill>
+                    <a:blip r:embed="rId11"/>
+                    <a:stretch>
+                      <a:fillRect/>
+                    </a:stretch>
+                  </pic:blipFill>
+                  <pic:spPr>
+                    <a:xfrm>
+                      <a:off x="0" y="0"/>
+                      <a:ext cx="5669280" cy="3639065"/>
+                    </a:xfrm>
+                    <a:prstGeom prst="rect"/>
+                  </pic:spPr>
+                </pic:pic>
+              </a:graphicData>
+            </a:graphic>
+          </wp:inline>
+        </w:drawing>
+      </w:r>
+    </w:p>
+    <w:p>
+      <w:pPr>
+        <w:jc w:val="center"/>
+      </w:pPr>
+      <w:r>
+        <w:rPr>
+          <w:i/>
+          <w:color w:val="222222"/>
+          <w:sz w:val="18"/>
+        </w:rPr>
+        <w:t>Le bouton JL ferme, en bas a droite de la page du lab.</w:t>
+      </w:r>
+    </w:p>
+    <w:p>
+      <w:pPr>
+        <w:jc w:val="center"/>
+      </w:pPr>
+      <w:r>
+        <w:drawing>
+          <wp:inline xmlns:a="http://schemas.openxmlformats.org/drawingml/2006/main" xmlns:pic="http://schemas.openxmlformats.org/drawingml/2006/picture">
+            <wp:extent cx="5669280" cy="3639065"/>
+            <wp:docPr id="4" name="Picture 4"/>
+            <wp:cNvGraphicFramePr>
+              <a:graphicFrameLocks noChangeAspect="1"/>
+            </wp:cNvGraphicFramePr>
+            <a:graphic>
+              <a:graphicData uri="http://schemas.openxmlformats.org/drawingml/2006/picture">
+                <pic:pic>
+                  <pic:nvPicPr>
+                    <pic:cNvPr id="0" name="coach-panel.png"/>
+                    <pic:cNvPicPr/>
+                  </pic:nvPicPr>
+                  <pic:blipFill>
+                    <a:blip r:embed="rId12"/>
+                    <a:stretch>
+                      <a:fillRect/>
+                    </a:stretch>
+                  </pic:blipFill>
+                  <pic:spPr>
+                    <a:xfrm>
+                      <a:off x="0" y="0"/>
+                      <a:ext cx="5669280" cy="3639065"/>
+                    </a:xfrm>
+                    <a:prstGeom prst="rect"/>
+                  </pic:spPr>
+                </pic:pic>
+              </a:graphicData>
+            </a:graphic>
+          </wp:inline>
+        </w:drawing>
+      </w:r>
+    </w:p>
+    <w:p>
+      <w:pPr>
+        <w:jc w:val="center"/>
+      </w:pPr>
+      <w:r>
+        <w:rPr>
+          <w:i/>
+          <w:color w:val="222222"/>
+          <w:sz w:val="18"/>
+        </w:rPr>
+        <w:t>Le panneau ouvert : onglets Briefing / Indices / Journal / Quiz / Progression.</w:t>
+      </w:r>
+    </w:p>
+    <w:p>
+      <w:pPr>
         <w:pStyle w:val="ListNumber"/>
       </w:pPr>
       <w:r>
@@ -1274,7 +1389,7 @@
         <w:drawing>
           <wp:inline xmlns:a="http://schemas.openxmlformats.org/drawingml/2006/main" xmlns:pic="http://schemas.openxmlformats.org/drawingml/2006/picture">
             <wp:extent cx="5669280" cy="2769559"/>
-            <wp:docPr id="3" name="Picture 3"/>
+            <wp:docPr id="5" name="Picture 5"/>
             <wp:cNvGraphicFramePr>
               <a:graphicFrameLocks noChangeAspect="1"/>
             </wp:cNvGraphicFramePr>
@@ -1286,7 +1401,7 @@
                     <pic:cNvPicPr/>
                   </pic:nvPicPr>
                   <pic:blipFill>
-                    <a:blip r:embed="rId11"/>
+                    <a:blip r:embed="rId13"/>
                     <a:stretch>
                       <a:fillRect/>
                     </a:stretch>

</xml_diff>

<commit_message>
docs: captures panneau indices + progression eleve, regen docx, script de capture
- 2 nouvelles captures: coach-hints (echelle 5 niveaux -5/-10/-20/-35/-50 %)
  et coach-progress (score, badges, rejoindre une cohorte)
- 5 captures existantes regenerees sur l'UI courante (cohorte demo nettoyee)
- guides FR/EN: section eleve etoffee sur l'echelle d'indices graduee +
  references des deux nouvelles captures
- build_coach_guide.py: insere les 2 captures en section 5; docx regenere
  (7 images: 2 mermaid + 5 captures)
- scripts/screenshots.py: capture reproductible des 7 PNG via Playwright
  (Chrome systeme) pour rafraichir la doc apres tout changement d'UI
- scripts/pull-models.sh: telechargement idempotent des modeles Ollama
  (juge + assistant), reference par les guides section 3

Co-Authored-By: Claude Opus 4.8 (1M context) <noreply@anthropic.com>
</commit_message>
<xml_diff>
--- a/docs/GUIDE-COACH-PWNZZAI.docx
+++ b/docs/GUIDE-COACH-PWNZZAI.docx
@@ -526,7 +526,7 @@
       <w:r>
         <w:drawing>
           <wp:inline xmlns:a="http://schemas.openxmlformats.org/drawingml/2006/main" xmlns:pic="http://schemas.openxmlformats.org/drawingml/2006/picture">
-            <wp:extent cx="5669280" cy="6232377"/>
+            <wp:extent cx="5669280" cy="3884223"/>
             <wp:docPr id="2" name="Picture 2"/>
             <wp:cNvGraphicFramePr>
               <a:graphicFrameLocks noChangeAspect="1"/>
@@ -547,7 +547,7 @@
                   <pic:spPr>
                     <a:xfrm>
                       <a:off x="0" y="0"/>
-                      <a:ext cx="5669280" cy="6232377"/>
+                      <a:ext cx="5669280" cy="3884223"/>
                     </a:xfrm>
                     <a:prstGeom prst="rect"/>
                   </pic:spPr>
@@ -978,6 +978,120 @@
       </w:r>
     </w:p>
     <w:p>
+      <w:r>
+        <w:t>Onglet Indices - l'echelle graduee : N1 -5 %, N2 -10 %, N3 -20 %, N4 -35 %, N5 -50 %. Revelation progressive (N+1 reste grise tant que N n'est pas pris) ; chaque indice baisse le score du lab, qui ne descend jamais sous 50/100 (score = max(50, 100 - somme des couts)). Contenu genere par le modele local, adapte aux tentatives ratees (N1 = declic, N5 = exemple quasi complet).</w:t>
+      </w:r>
+    </w:p>
+    <w:p>
+      <w:pPr>
+        <w:jc w:val="center"/>
+      </w:pPr>
+      <w:r>
+        <w:drawing>
+          <wp:inline xmlns:a="http://schemas.openxmlformats.org/drawingml/2006/main" xmlns:pic="http://schemas.openxmlformats.org/drawingml/2006/picture">
+            <wp:extent cx="5669280" cy="3639065"/>
+            <wp:docPr id="5" name="Picture 5"/>
+            <wp:cNvGraphicFramePr>
+              <a:graphicFrameLocks noChangeAspect="1"/>
+            </wp:cNvGraphicFramePr>
+            <a:graphic>
+              <a:graphicData uri="http://schemas.openxmlformats.org/drawingml/2006/picture">
+                <pic:pic>
+                  <pic:nvPicPr>
+                    <pic:cNvPr id="0" name="coach-hints.png"/>
+                    <pic:cNvPicPr/>
+                  </pic:nvPicPr>
+                  <pic:blipFill>
+                    <a:blip r:embed="rId13"/>
+                    <a:stretch>
+                      <a:fillRect/>
+                    </a:stretch>
+                  </pic:blipFill>
+                  <pic:spPr>
+                    <a:xfrm>
+                      <a:off x="0" y="0"/>
+                      <a:ext cx="5669280" cy="3639065"/>
+                    </a:xfrm>
+                    <a:prstGeom prst="rect"/>
+                  </pic:spPr>
+                </pic:pic>
+              </a:graphicData>
+            </a:graphic>
+          </wp:inline>
+        </w:drawing>
+      </w:r>
+    </w:p>
+    <w:p>
+      <w:pPr>
+        <w:jc w:val="center"/>
+      </w:pPr>
+      <w:r>
+        <w:rPr>
+          <w:i/>
+          <w:color w:val="222222"/>
+          <w:sz w:val="18"/>
+        </w:rPr>
+        <w:t>Onglet Indices : 5 niveaux gradues -5/-10/-20/-35/-50 %.</w:t>
+      </w:r>
+    </w:p>
+    <w:p>
+      <w:r>
+        <w:t>Onglet Progression - le bilan de l'eleve : bouton Verifier ma reussite (soumet la conversation au juge), score par lab, score moyen sur 100, labs reussis et les 4 badges. C'est aussi d'ici que l'eleve rejoint une cohorte (champ en bas, code fourni par le prof).</w:t>
+      </w:r>
+    </w:p>
+    <w:p>
+      <w:pPr>
+        <w:jc w:val="center"/>
+      </w:pPr>
+      <w:r>
+        <w:drawing>
+          <wp:inline xmlns:a="http://schemas.openxmlformats.org/drawingml/2006/main" xmlns:pic="http://schemas.openxmlformats.org/drawingml/2006/picture">
+            <wp:extent cx="5669280" cy="3639065"/>
+            <wp:docPr id="6" name="Picture 6"/>
+            <wp:cNvGraphicFramePr>
+              <a:graphicFrameLocks noChangeAspect="1"/>
+            </wp:cNvGraphicFramePr>
+            <a:graphic>
+              <a:graphicData uri="http://schemas.openxmlformats.org/drawingml/2006/picture">
+                <pic:pic>
+                  <pic:nvPicPr>
+                    <pic:cNvPr id="0" name="coach-progress.png"/>
+                    <pic:cNvPicPr/>
+                  </pic:nvPicPr>
+                  <pic:blipFill>
+                    <a:blip r:embed="rId14"/>
+                    <a:stretch>
+                      <a:fillRect/>
+                    </a:stretch>
+                  </pic:blipFill>
+                  <pic:spPr>
+                    <a:xfrm>
+                      <a:off x="0" y="0"/>
+                      <a:ext cx="5669280" cy="3639065"/>
+                    </a:xfrm>
+                    <a:prstGeom prst="rect"/>
+                  </pic:spPr>
+                </pic:pic>
+              </a:graphicData>
+            </a:graphic>
+          </wp:inline>
+        </w:drawing>
+      </w:r>
+    </w:p>
+    <w:p>
+      <w:pPr>
+        <w:jc w:val="center"/>
+      </w:pPr>
+      <w:r>
+        <w:rPr>
+          <w:i/>
+          <w:color w:val="222222"/>
+          <w:sz w:val="18"/>
+        </w:rPr>
+        <w:t>Onglet Progression : score, badges, rejoindre une cohorte.</w:t>
+      </w:r>
+    </w:p>
+    <w:p>
       <w:pPr>
         <w:pStyle w:val="ListNumber"/>
       </w:pPr>
@@ -1389,7 +1503,7 @@
         <w:drawing>
           <wp:inline xmlns:a="http://schemas.openxmlformats.org/drawingml/2006/main" xmlns:pic="http://schemas.openxmlformats.org/drawingml/2006/picture">
             <wp:extent cx="5669280" cy="2769559"/>
-            <wp:docPr id="5" name="Picture 5"/>
+            <wp:docPr id="7" name="Picture 7"/>
             <wp:cNvGraphicFramePr>
               <a:graphicFrameLocks noChangeAspect="1"/>
             </wp:cNvGraphicFramePr>
@@ -1401,7 +1515,7 @@
                     <pic:cNvPicPr/>
                   </pic:nvPicPr>
                   <pic:blipFill>
-                    <a:blip r:embed="rId13"/>
+                    <a:blip r:embed="rId15"/>
                     <a:stretch>
                       <a:fillRect/>
                     </a:stretch>

</xml_diff>